<commit_message>
docs(editor): document search configuration (#2067)
* docs(editor): update search configuration

* docs(editor): demonstrate tracked deletion search

* docs(editor): separate search text overrides

* docs(editor): add search config explorer

Ported-From-Source-Repo: superdoc/orbit
Ported-From-Source-Commit: d4854c51a0efb743ca7807a50094f7af1bb7eb09
Ported-Public-Prefix: superdoc/public
</commit_message>
<xml_diff>
--- a/apps/docs/public/fixtures/search-sample.docx
+++ b/apps/docs/public/fixtures/search-sample.docx
@@ -14,7 +14,15 @@
     </w:p>
     <w:p>
       <w:r>
-        <w:t xml:space="preserve">During review, the Client owner compares each client request with the source file. The Client team then replaces outdated terms.</w:t>
+        <w:t xml:space="preserve">During review, the Client owner compares each</w:t>
+      </w:r>
+      <w:del w:id="0" w:author="SuperDoc Test User" w:date="2025-01-15T00:00:00Z">
+        <w:r>
+          <w:delText xml:space="preserve"> Legacy</w:delText>
+        </w:r>
+      </w:del>
+      <w:r>
+        <w:t xml:space="preserve"> client request with the source file. The Client team then replaces outdated terms.</w:t>
       </w:r>
     </w:p>
     <w:p>

</xml_diff>